<commit_message>
Add subscription licensing and amount-prefilled UPI QR codes
</commit_message>
<xml_diff>
--- a/APP-GUIDE.docx
+++ b/APP-GUIDE.docx
@@ -336,7 +336,7 @@
         <w:pStyle w:val="ListNumber"/>
       </w:pPr>
       <w:r>
-        <w:t>Optional: install as an app — phone: ⋮ menu → “Add to Home screen / Install app”; laptop: ⬇ icon in the address bar → Install. It then opens full-screen like a normal app and works offline.</w:t>
+        <w:t>Optional: install as an app — phone: ⋮ menu → “Add to Home screen / Install app”; laptop: ⬇ icon in the address bar → Install. It opens full-screen. A server connection is still required to verify the subscription; when offline, normal hotel screens remain locked and cached data can be exported from the subscription screen.</w:t>
       </w:r>
     </w:p>
     <w:p>
@@ -2289,10 +2289,7 @@
     </w:p>
     <w:p>
       <w:r>
-        <w:rPr>
-          <w:b w:val="0"/>
-        </w:rPr>
-        <w:t>The app files (index.html, server.js, assets…) are pushed to the GitHub repo Hotel-Software and deployed free on Render. The phone APK can be rebuilt to point at the Render URL so the phone and laptop share one live database (data stays on the phone as fallback when offline). Until that happens, the APK runs its own bundled copy of the app with phone-local data.</w:t>
+        <w:t>Deploy the app files (index.html, server.js, assets…) to the hotel server. The Android APK must be rebuilt with Main.java REMOTE_URL set to the licensed server so the phone and laptop use the same subscription and database. A standalone offline APK cannot verify its license; offline, the subscription screen remains and offers cached-backup export.</w:t>
       </w:r>
     </w:p>
     <w:p>
@@ -3092,6 +3089,152 @@
         <w:t>— End of guide · generated 23 September 2026 · E. &amp; O. E. —</w:t>
       </w:r>
     </w:p>
+    <w:p>
+      <w:r>
+        <w:br w:type="page"/>
+      </w:r>
+    </w:p>
+    <w:p>
+      <w:pPr>
+        <w:pStyle w:val="Heading1"/>
+      </w:pPr>
+      <w:r>
+        <w:t>Subscription and payment</w:t>
+      </w:r>
+    </w:p>
+    <w:p>
+      <w:r>
+        <w:t>This software is licensed per hotel/server installation. Each hotel must use its own server deployment and database; do not share one installation between unrelated hotels.</w:t>
+      </w:r>
+    </w:p>
+    <w:p>
+      <w:pPr>
+        <w:pStyle w:val="Heading2"/>
+      </w:pPr>
+      <w:r>
+        <w:t>Plans</w:t>
+      </w:r>
+    </w:p>
+    <w:p>
+      <w:pPr>
+        <w:pStyle w:val="ListBullet"/>
+      </w:pPr>
+      <w:r>
+        <w:t>Monthly — ₹700 for 1 month</w:t>
+      </w:r>
+    </w:p>
+    <w:p>
+      <w:pPr>
+        <w:pStyle w:val="ListBullet"/>
+      </w:pPr>
+      <w:r>
+        <w:t>Quarterly — ₹2,100 for 3 months</w:t>
+      </w:r>
+    </w:p>
+    <w:p>
+      <w:pPr>
+        <w:pStyle w:val="ListBullet"/>
+      </w:pPr>
+      <w:r>
+        <w:t>Half yearly — ₹4,199 for 6 months</w:t>
+      </w:r>
+    </w:p>
+    <w:p>
+      <w:pPr>
+        <w:pStyle w:val="ListBullet"/>
+      </w:pPr>
+      <w:r>
+        <w:t>Yearly — ₹6,999 for 12 months</w:t>
+      </w:r>
+    </w:p>
+    <w:p>
+      <w:pPr>
+        <w:pStyle w:val="Heading2"/>
+      </w:pPr>
+      <w:r>
+        <w:t>How to activate or renew</w:t>
+      </w:r>
+    </w:p>
+    <w:p>
+      <w:pPr>
+        <w:pStyle w:val="ListNumber"/>
+      </w:pPr>
+      <w:r>
+        <w:t>Choose a plan. The app displays a separate UPI QR generated from the supplied payee details, with the exact plan amount prefilled. Scan it, confirm the payee and amount, and enter your UPI PIN only in your UPI payment app (never on the hotel website).</w:t>
+      </w:r>
+    </w:p>
+    <w:p>
+      <w:pPr>
+        <w:pStyle w:val="ListNumber"/>
+      </w:pPr>
+      <w:r>
+        <w:t>After the UPI app confirms success, enter the UTR/transaction reference and contact details, then submit the request.</w:t>
+      </w:r>
+    </w:p>
+    <w:p>
+      <w:pPr>
+        <w:pStyle w:val="ListNumber"/>
+      </w:pPr>
+      <w:r>
+        <w:t>The UPI payment does not automatically notify or verify the hotel server. After a successful payment, enter the UTR/transaction reference in the app. Hotel features remain locked until the owner checks the payment and manually approves the request.</w:t>
+      </w:r>
+    </w:p>
+    <w:p>
+      <w:pPr>
+        <w:pStyle w:val="ListNumber"/>
+      </w:pPr>
+      <w:r>
+        <w:t>The owner opens the review panel on the subscription screen and uses the private SUBSCRIPTION_ADMIN_KEY configured on the server. Never share that key with customers or include it in the project files.</w:t>
+      </w:r>
+    </w:p>
+    <w:p>
+      <w:pPr>
+        <w:pStyle w:val="ListNumber"/>
+      </w:pPr>
+      <w:r>
+        <w:t>After approval, the subscription starts immediately, or extends from the current expiry date when renewed early.</w:t>
+      </w:r>
+    </w:p>
+    <w:p>
+      <w:pPr>
+        <w:pStyle w:val="Heading2"/>
+      </w:pPr>
+      <w:r>
+        <w:t>Expiry, reminders and data</w:t>
+      </w:r>
+    </w:p>
+    <w:p>
+      <w:pPr>
+        <w:pStyle w:val="ListBullet"/>
+      </w:pPr>
+      <w:r>
+        <w:t>The app shows an in-app reminder 4 days before expiry.</w:t>
+      </w:r>
+    </w:p>
+    <w:p>
+      <w:pPr>
+        <w:pStyle w:val="ListBullet"/>
+      </w:pPr>
+      <w:r>
+        <w:t>At expiry, normal hotel screens and the hotel-state API lock until renewal is approved.</w:t>
+      </w:r>
+    </w:p>
+    <w:p>
+      <w:pPr>
+        <w:pStyle w:val="ListBullet"/>
+      </w:pPr>
+      <w:r>
+        <w:t>Expiry does not delete hotel data. The renewal screen keeps local cached-data export and server-backup download available.</w:t>
+      </w:r>
+    </w:p>
+    <w:p>
+      <w:pPr>
+        <w:pStyle w:val="ListBullet"/>
+      </w:pPr>
+      <w:r>
+        <w:t>Keep the server database, subscription file and backups on persistent storage. If the server is unreachable, the app cannot verify the license and stays locked until it reconnects.</w:t>
+      </w:r>
+    </w:p>
     <w:sectPr>
       <w:pgSz w:w="12240" w:h="15840"/>
       <w:pgMar w:top="1440" w:right="1800" w:bottom="1440" w:left="1800" w:header="720" w:footer="720" w:gutter="0"/>

</xml_diff>